<commit_message>
Strengthen time-series MLP example configuration
</commit_message>
<xml_diff>
--- a/examples/timeseries/doc/torch_ts_mlp.docx
+++ b/examples/timeseries/doc/torch_ts_mlp.docx
@@ -824,6 +824,15 @@
         <w:t xml:space="preserve">(</w:t>
       </w:r>
       <w:r>
+        <w:br/>
+      </w:r>
+      <w:r>
+        <w:rPr>
+          <w:rStyle w:val="NormalTok"/>
+        </w:rPr>
+        <w:t xml:space="preserve">  </w:t>
+      </w:r>
+      <w:r>
         <w:rPr>
           <w:rStyle w:val="FunctionTok"/>
         </w:rPr>
@@ -833,7 +842,16 @@
         <w:rPr>
           <w:rStyle w:val="NormalTok"/>
         </w:rPr>
-        <w:t xml:space="preserve">(), </w:t>
+        <w:t xml:space="preserve">(),</w:t>
+      </w:r>
+      <w:r>
+        <w:br/>
+      </w:r>
+      <w:r>
+        <w:rPr>
+          <w:rStyle w:val="NormalTok"/>
+        </w:rPr>
+        <w:t xml:space="preserve">  </w:t>
       </w:r>
       <w:r>
         <w:rPr>
@@ -857,36 +875,159 @@
         <w:rPr>
           <w:rStyle w:val="NormalTok"/>
         </w:rPr>
+        <w:t xml:space="preserve">,</w:t>
+      </w:r>
+      <w:r>
+        <w:br/>
+      </w:r>
+      <w:r>
+        <w:rPr>
+          <w:rStyle w:val="NormalTok"/>
+        </w:rPr>
+        <w:t xml:space="preserve">  </w:t>
+      </w:r>
+      <w:r>
+        <w:rPr>
+          <w:rStyle w:val="AttributeTok"/>
+        </w:rPr>
+        <w:t xml:space="preserve">hidden_sizes =</w:t>
+      </w:r>
+      <w:r>
+        <w:rPr>
+          <w:rStyle w:val="NormalTok"/>
+        </w:rPr>
+        <w:t xml:space="preserve"> </w:t>
+      </w:r>
+      <w:r>
+        <w:rPr>
+          <w:rStyle w:val="FunctionTok"/>
+        </w:rPr>
+        <w:t xml:space="preserve">c</w:t>
+      </w:r>
+      <w:r>
+        <w:rPr>
+          <w:rStyle w:val="NormalTok"/>
+        </w:rPr>
+        <w:t xml:space="preserve">(</w:t>
+      </w:r>
+      <w:r>
+        <w:rPr>
+          <w:rStyle w:val="DecValTok"/>
+        </w:rPr>
+        <w:t xml:space="preserve">64</w:t>
+      </w:r>
+      <w:r>
+        <w:rPr>
+          <w:rStyle w:val="DataTypeTok"/>
+        </w:rPr>
+        <w:t xml:space="preserve">L</w:t>
+      </w:r>
+      <w:r>
+        <w:rPr>
+          <w:rStyle w:val="NormalTok"/>
+        </w:rPr>
         <w:t xml:space="preserve">, </w:t>
       </w:r>
       <w:r>
         <w:rPr>
+          <w:rStyle w:val="DecValTok"/>
+        </w:rPr>
+        <w:t xml:space="preserve">32</w:t>
+      </w:r>
+      <w:r>
+        <w:rPr>
+          <w:rStyle w:val="DataTypeTok"/>
+        </w:rPr>
+        <w:t xml:space="preserve">L</w:t>
+      </w:r>
+      <w:r>
+        <w:rPr>
+          <w:rStyle w:val="NormalTok"/>
+        </w:rPr>
+        <w:t xml:space="preserve">, </w:t>
+      </w:r>
+      <w:r>
+        <w:rPr>
+          <w:rStyle w:val="DecValTok"/>
+        </w:rPr>
+        <w:t xml:space="preserve">16</w:t>
+      </w:r>
+      <w:r>
+        <w:rPr>
+          <w:rStyle w:val="DataTypeTok"/>
+        </w:rPr>
+        <w:t xml:space="preserve">L</w:t>
+      </w:r>
+      <w:r>
+        <w:rPr>
+          <w:rStyle w:val="NormalTok"/>
+        </w:rPr>
+        <w:t xml:space="preserve">),</w:t>
+      </w:r>
+      <w:r>
+        <w:br/>
+      </w:r>
+      <w:r>
+        <w:rPr>
+          <w:rStyle w:val="NormalTok"/>
+        </w:rPr>
+        <w:t xml:space="preserve">  </w:t>
+      </w:r>
+      <w:r>
+        <w:rPr>
           <w:rStyle w:val="AttributeTok"/>
         </w:rPr>
-        <w:t xml:space="preserve">hidden_sizes =</w:t>
-      </w:r>
-      <w:r>
-        <w:rPr>
-          <w:rStyle w:val="NormalTok"/>
-        </w:rPr>
-        <w:t xml:space="preserve"> </w:t>
-      </w:r>
-      <w:r>
-        <w:rPr>
-          <w:rStyle w:val="FunctionTok"/>
-        </w:rPr>
-        <w:t xml:space="preserve">c</w:t>
-      </w:r>
-      <w:r>
-        <w:rPr>
-          <w:rStyle w:val="NormalTok"/>
-        </w:rPr>
-        <w:t xml:space="preserve">(</w:t>
+        <w:t xml:space="preserve">epochs =</w:t>
+      </w:r>
+      <w:r>
+        <w:rPr>
+          <w:rStyle w:val="NormalTok"/>
+        </w:rPr>
+        <w:t xml:space="preserve"> </w:t>
       </w:r>
       <w:r>
         <w:rPr>
           <w:rStyle w:val="DecValTok"/>
         </w:rPr>
+        <w:t xml:space="preserve">1000</w:t>
+      </w:r>
+      <w:r>
+        <w:rPr>
+          <w:rStyle w:val="DataTypeTok"/>
+        </w:rPr>
+        <w:t xml:space="preserve">L</w:t>
+      </w:r>
+      <w:r>
+        <w:rPr>
+          <w:rStyle w:val="NormalTok"/>
+        </w:rPr>
+        <w:t xml:space="preserve">,</w:t>
+      </w:r>
+      <w:r>
+        <w:br/>
+      </w:r>
+      <w:r>
+        <w:rPr>
+          <w:rStyle w:val="NormalTok"/>
+        </w:rPr>
+        <w:t xml:space="preserve">  </w:t>
+      </w:r>
+      <w:r>
+        <w:rPr>
+          <w:rStyle w:val="AttributeTok"/>
+        </w:rPr>
+        <w:t xml:space="preserve">batch_size =</w:t>
+      </w:r>
+      <w:r>
+        <w:rPr>
+          <w:rStyle w:val="NormalTok"/>
+        </w:rPr>
+        <w:t xml:space="preserve"> </w:t>
+      </w:r>
+      <w:r>
+        <w:rPr>
+          <w:rStyle w:val="DecValTok"/>
+        </w:rPr>
         <w:t xml:space="preserve">16</w:t>
       </w:r>
       <w:r>
@@ -896,28 +1037,13 @@
         <w:t xml:space="preserve">L</w:t>
       </w:r>
       <w:r>
-        <w:rPr>
-          <w:rStyle w:val="NormalTok"/>
-        </w:rPr>
-        <w:t xml:space="preserve">, </w:t>
-      </w:r>
-      <w:r>
-        <w:rPr>
-          <w:rStyle w:val="DecValTok"/>
-        </w:rPr>
-        <w:t xml:space="preserve">8</w:t>
-      </w:r>
-      <w:r>
-        <w:rPr>
-          <w:rStyle w:val="DataTypeTok"/>
-        </w:rPr>
-        <w:t xml:space="preserve">L</w:t>
-      </w:r>
-      <w:r>
-        <w:rPr>
-          <w:rStyle w:val="NormalTok"/>
-        </w:rPr>
-        <w:t xml:space="preserve">))</w:t>
+        <w:br/>
+      </w:r>
+      <w:r>
+        <w:rPr>
+          <w:rStyle w:val="NormalTok"/>
+        </w:rPr>
+        <w:t xml:space="preserve">)</w:t>
       </w:r>
       <w:r>
         <w:br/>
@@ -1384,7 +1510,7 @@
         <w:rPr>
           <w:rStyle w:val="VerbatimChar"/>
         </w:rPr>
-        <w:t xml:space="preserve">## [1] 1.383876</w:t>
+        <w:t xml:space="preserve">## [1] 2.524216e-06</w:t>
       </w:r>
     </w:p>
     <w:p>
@@ -1714,7 +1840,7 @@
         <w:rPr>
           <w:rStyle w:val="VerbatimChar"/>
         </w:rPr>
-        <w:t xml:space="preserve">## [1] "0.41, -0.86"  "0.17, -0.87"  "-0.08, -0.89" "-0.32, -0.91" "-0.54, -0.93"</w:t>
+        <w:t xml:space="preserve">## [1] "0.41, 0.41"   "0.17, 0.18"   "-0.08, -0.07" "-0.32, -0.32" "-0.54, -0.54"</w:t>
       </w:r>
     </w:p>
     <w:p>
@@ -1819,7 +1945,7 @@
         <w:rPr>
           <w:rStyle w:val="VerbatimChar"/>
         </w:rPr>
-        <w:t xml:space="preserve">##         mse    smape        R2</w:t>
+        <w:t xml:space="preserve">##            mse       smape       R2</w:t>
       </w:r>
       <w:r>
         <w:br/>
@@ -1828,7 +1954,7 @@
         <w:rPr>
           <w:rStyle w:val="VerbatimChar"/>
         </w:rPr>
-        <w:t xml:space="preserve">## 1 0.7720111 1.432987 -5.667899</w:t>
+        <w:t xml:space="preserve">## 1 1.384434e-06 0.005944111 0.999988</w:t>
       </w:r>
     </w:p>
     <w:p>
@@ -1928,7 +2054,7 @@
         <w:rPr>
           <w:rStyle w:val="VerbatimChar"/>
         </w:rPr>
-        <w:t xml:space="preserve">## [1] "smape: 143.30"</w:t>
+        <w:t xml:space="preserve">## [1] "smape: 0.59"</w:t>
       </w:r>
     </w:p>
     <w:p>
@@ -2147,7 +2273,7 @@
               <a:graphicData uri="http://schemas.openxmlformats.org/drawingml/2006/picture">
                 <pic:pic>
                   <pic:nvPicPr>
-                    <pic:cNvPr descr="C:\Git\dal\daltoolboxdp\examples\timeseries\doc\torch_ts_mlp_files/d7123377a3d566b2377d8f339c96bbf9bd4b6da4.png" id="14" name="Picture"/>
+                    <pic:cNvPr descr="C:\Git\dal\daltoolboxdp\examples\timeseries\doc\torch_ts_mlp_files/95d3097269ce2eba3c29c370c53d9b04ac7cd0fe.png" id="14" name="Picture"/>
                     <pic:cNvPicPr>
                       <a:picLocks noChangeArrowheads="1" noChangeAspect="1"/>
                     </pic:cNvPicPr>
@@ -2702,7 +2828,7 @@
               <a:graphicData uri="http://schemas.openxmlformats.org/drawingml/2006/picture">
                 <pic:pic>
                   <pic:nvPicPr>
-                    <pic:cNvPr descr="C:\Git\dal\daltoolboxdp\examples\timeseries\doc\torch_ts_mlp_files/6c3530ad0531ca237ad5222dc60383f95016ffb0.png" id="17" name="Picture"/>
+                    <pic:cNvPr descr="C:\Git\dal\daltoolboxdp\examples\timeseries\doc\torch_ts_mlp_files/0e0f36e2362db5628c733bcc8f5c904e4d3fbd2b.png" id="17" name="Picture"/>
                     <pic:cNvPicPr>
                       <a:picLocks noChangeArrowheads="1" noChangeAspect="1"/>
                     </pic:cNvPicPr>
@@ -2774,6 +2900,27 @@
       </w:r>
       <w:r>
         <w:t xml:space="preserve">, so only the training curve is shown.</w:t>
+      </w:r>
+      <w:r>
+        <w:t xml:space="preserve"> </w:t>
+      </w:r>
+      <w:r>
+        <w:t xml:space="preserve">- This example uses</w:t>
+      </w:r>
+      <w:r>
+        <w:t xml:space="preserve"> </w:t>
+      </w:r>
+      <w:r>
+        <w:rPr>
+          <w:rStyle w:val="VerbatimChar"/>
+        </w:rPr>
+        <w:t xml:space="preserve">epochs = 1000L</w:t>
+      </w:r>
+      <w:r>
+        <w:t xml:space="preserve"> </w:t>
+      </w:r>
+      <w:r>
+        <w:t xml:space="preserve">explicitly so the feedforward MLP reaches a competitive fit on this series.</w:t>
       </w:r>
       <w:r>
         <w:t xml:space="preserve"> </w:t>

</xml_diff>